<commit_message>
W27 correction: e-invoicing gate belongs to Supplier Portal + approved product-capabilities file + resend-email utility
- Article/post/visual-data corrected: OCR allocation-number validation gate
  in the Supplier Portal (stop in portal or stamp allocation number; only
  compliant invoices reach the ERP). Meteor references removed.
- C-core/product-capabilities.md: approved claims whitelist, now loaded by
  the Researcher and Gatekeeper prompts.
- resend-week-email workflow for corrected deliveries.

Co-Authored-By: Claude Fable 5 <noreply@anthropic.com>
</commit_message>
<xml_diff>
--- a/O-output/W27/final/article.docx
+++ b/O-output/W27/final/article.docx
@@ -211,7 +211,7 @@
         <w:pStyle w:val="Heading2"/>
       </w:pPr>
       <w:r>
-        <w:t>What Compliance-Ready Financial Operations Looks Like</w:t>
+        <w:t>What a Compliance-Ready Invoice Gate Looks Like</w:t>
       </w:r>
     </w:p>
     <w:p>
@@ -219,7 +219,7 @@
         <w:rPr>
           <w:b w:val="0"/>
         </w:rPr>
-        <w:t>Compliance-ready AP infrastructure treats allocation number validation as a systematic control, not a manual checkpoint.</w:t>
+        <w:t>Compliance-ready AP infrastructure treats allocation number validation as a systematic gate in front of the ERP, not a manual checkpoint after it.</w:t>
       </w:r>
     </w:p>
     <w:p>
@@ -243,13 +243,13 @@
         <w:rPr>
           <w:b/>
         </w:rPr>
-        <w:t>Automated allocation-number validation</w:t>
+        <w:t>OCR validation at invoice intake.</w:t>
       </w:r>
       <w:r>
         <w:rPr>
           <w:b w:val="0"/>
         </w:rPr>
-        <w:t xml:space="preserve"> at invoice intake, before payment approval</w:t>
+        <w:t xml:space="preserve"> The system reads the allocation number on every incoming invoice automatically.</w:t>
       </w:r>
     </w:p>
     <w:p>
@@ -265,13 +265,13 @@
         <w:rPr>
           <w:b/>
         </w:rPr>
-        <w:t>Matching logic</w:t>
+        <w:t>Rule-based matching.</w:t>
       </w:r>
       <w:r>
         <w:rPr>
           <w:b w:val="0"/>
         </w:rPr>
-        <w:t xml:space="preserve"> that reconciles allocation numbers against invoice value, vendor, and VAT data</w:t>
+        <w:t xml:space="preserve"> The allocation number is checked against the invoice amount and the thresholds defined by law.</w:t>
       </w:r>
     </w:p>
     <w:p>
@@ -287,13 +287,13 @@
         <w:rPr>
           <w:b/>
         </w:rPr>
-        <w:t>ERP integration</w:t>
+        <w:t>A hard stop for non-compliant invoices.</w:t>
       </w:r>
       <w:r>
         <w:rPr>
           <w:b w:val="0"/>
         </w:rPr>
-        <w:t xml:space="preserve"> that keeps your ERP as the system of record, not a parallel spreadsheet</w:t>
+        <w:t xml:space="preserve"> An invoice that fails validation is held at the gate. It never enters the ERP.</w:t>
       </w:r>
     </w:p>
     <w:p>
@@ -309,13 +309,35 @@
         <w:rPr>
           <w:b/>
         </w:rPr>
-        <w:t>Audit trail</w:t>
+        <w:t>Self-service allocation where permitted.</w:t>
       </w:r>
       <w:r>
         <w:rPr>
           <w:b w:val="0"/>
         </w:rPr>
-        <w:t xml:space="preserve"> documentation, ready for Tax Authority review without manual reconstruction</w:t>
+        <w:t xml:space="preserve"> When an invoice arrives without an allocation number, the system obtains one and stamps it on the invoice itself.</w:t>
+      </w:r>
+    </w:p>
+    <w:p>
+      <w:pPr>
+        <w:pStyle w:val="ListBullet"/>
+      </w:pPr>
+      <w:r>
+        <w:rPr>
+          <w:b w:val="0"/>
+        </w:rPr>
+      </w:r>
+      <w:r>
+        <w:rPr>
+          <w:b/>
+        </w:rPr>
+        <w:t>A clean ERP.</w:t>
+      </w:r>
+      <w:r>
+        <w:rPr>
+          <w:b w:val="0"/>
+        </w:rPr>
+        <w:t xml:space="preserve"> Only invoices that meet the Tax Authority's conditions are pushed through, so the ERP remains the trusted system of record.</w:t>
       </w:r>
     </w:p>
     <w:p>
@@ -323,7 +345,7 @@
         <w:rPr>
           <w:b w:val="0"/>
         </w:rPr>
-        <w:t>This is the kind of infrastructure Meteor builds for finance and procurement teams operating at scale. Meteor processes over 20,000 transactions and integrates with more than 1,000 ERP systems across 400+ enterprise clients and 150+ global banks. That scale matters here specifically because allocation number validation is not a feature to bolt on. It is a control layer that has to work at every invoice, every time, without exception.</w:t>
+        <w:t>This is the control layer StoreNext's Supplier Portal implements between suppliers and the ERP. The portal validates every incoming invoice with OCR, checks the allocation number against the invoice amount and the legal thresholds, and stops non-compliant invoices inside the portal. Where the regulation permits, it assigns and stamps an allocation number on the invoice itself. Allocation number validation is not a feature to bolt on. It is a gate that has to work at every invoice, every time, without exception.</w:t>
       </w:r>
     </w:p>
     <w:p>

</xml_diff>